<commit_message>
ACN Lab Report - File Sharing using Distributed Hash Table (DHT)
</commit_message>
<xml_diff>
--- a/Computer Networks/Advanced/Lab/Assignment_2/22CS02002_SohamChakraborty_Assignment_2.docx
+++ b/Computer Networks/Advanced/Lab/Assignment_2/22CS02002_SohamChakraborty_Assignment_2.docx
@@ -186,7 +186,6 @@
           <w:szCs w:val="30"/>
         </w:rPr>
       </w:pPr>
-      <w:proofErr w:type="gramStart"/>
       <w:r>
         <w:rPr>
           <w:b/>
@@ -205,7 +204,6 @@
         </w:rPr>
         <w:t>:-</w:t>
       </w:r>
-      <w:proofErr w:type="gramEnd"/>
       <w:r>
         <w:rPr>
           <w:sz w:val="30"/>
@@ -305,17 +303,8 @@
           <w:sz w:val="28"/>
           <w:szCs w:val="28"/>
         </w:rPr>
-        <w:t xml:space="preserve">ensure that taking input can be done along with reading and writing to client i.e. without using another thread and not </w:t>
-      </w:r>
-      <w:proofErr w:type="gramStart"/>
-      <w:r>
-        <w:rPr>
-          <w:sz w:val="28"/>
-          <w:szCs w:val="28"/>
-        </w:rPr>
-        <w:t>blocking ?</w:t>
-      </w:r>
-      <w:proofErr w:type="gramEnd"/>
+        <w:t>ensure that taking input can be done along with reading and writing to client i.e. without using another thread and not blocking ?</w:t>
+      </w:r>
     </w:p>
     <w:p>
       <w:pPr>
@@ -473,17 +462,8 @@
           <w:sz w:val="28"/>
           <w:szCs w:val="28"/>
         </w:rPr>
-        <w:t xml:space="preserve"> all of </w:t>
-      </w:r>
-      <w:proofErr w:type="gramStart"/>
-      <w:r>
-        <w:rPr>
-          <w:sz w:val="28"/>
-          <w:szCs w:val="28"/>
-        </w:rPr>
-        <w:t>them ?</w:t>
-      </w:r>
-      <w:proofErr w:type="gramEnd"/>
+        <w:t xml:space="preserve"> all of them ?</w:t>
+      </w:r>
     </w:p>
     <w:p>
       <w:pPr>
@@ -633,23 +613,7 @@
           <w:sz w:val="28"/>
           <w:szCs w:val="28"/>
         </w:rPr>
-        <w:t xml:space="preserve">. </w:t>
-      </w:r>
-      <w:proofErr w:type="gramStart"/>
-      <w:r>
-        <w:rPr>
-          <w:sz w:val="28"/>
-          <w:szCs w:val="28"/>
-        </w:rPr>
-        <w:t>Finally</w:t>
-      </w:r>
-      <w:proofErr w:type="gramEnd"/>
-      <w:r>
-        <w:rPr>
-          <w:sz w:val="28"/>
-          <w:szCs w:val="28"/>
-        </w:rPr>
-        <w:t xml:space="preserve"> we have </w:t>
+        <w:t xml:space="preserve">. Finally we have </w:t>
       </w:r>
       <w:proofErr w:type="spellStart"/>
       <w:r>
@@ -673,23 +637,7 @@
           <w:szCs w:val="28"/>
         </w:rPr>
         <w:br/>
-        <w:t xml:space="preserve">So, </w:t>
-      </w:r>
-      <w:proofErr w:type="gramStart"/>
-      <w:r>
-        <w:rPr>
-          <w:sz w:val="28"/>
-          <w:szCs w:val="28"/>
-        </w:rPr>
-        <w:t>ideally</w:t>
-      </w:r>
-      <w:proofErr w:type="gramEnd"/>
-      <w:r>
-        <w:rPr>
-          <w:sz w:val="28"/>
-          <w:szCs w:val="28"/>
-        </w:rPr>
-        <w:t xml:space="preserve"> we need to check only 3 </w:t>
+        <w:t xml:space="preserve">So, ideally we need to check only 3 </w:t>
       </w:r>
       <w:proofErr w:type="spellStart"/>
       <w:r>
@@ -813,23 +761,7 @@
           <w:sz w:val="28"/>
           <w:szCs w:val="28"/>
         </w:rPr>
-        <w:t xml:space="preserve"> addition or deletion. This prevents the </w:t>
-      </w:r>
-      <w:proofErr w:type="gramStart"/>
-      <w:r>
-        <w:rPr>
-          <w:sz w:val="28"/>
-          <w:szCs w:val="28"/>
-        </w:rPr>
-        <w:t>select(</w:t>
-      </w:r>
-      <w:proofErr w:type="gramEnd"/>
-      <w:r>
-        <w:rPr>
-          <w:sz w:val="28"/>
-          <w:szCs w:val="28"/>
-        </w:rPr>
-        <w:t>) from having to go through all FD_SETSIZE+1 Integers.</w:t>
+        <w:t xml:space="preserve"> addition or deletion. This prevents the select() from having to go through all FD_SETSIZE+1 Integers.</w:t>
       </w:r>
     </w:p>
     <w:p>
@@ -884,17 +816,8 @@
           <w:sz w:val="28"/>
           <w:szCs w:val="28"/>
         </w:rPr>
-        <w:t xml:space="preserve">, so that I know from whom a certain message is </w:t>
-      </w:r>
-      <w:proofErr w:type="gramStart"/>
-      <w:r>
-        <w:rPr>
-          <w:sz w:val="28"/>
-          <w:szCs w:val="28"/>
-        </w:rPr>
-        <w:t>coming ?</w:t>
-      </w:r>
-      <w:proofErr w:type="gramEnd"/>
+        <w:t>, so that I know from whom a certain message is coming ?</w:t>
+      </w:r>
     </w:p>
     <w:p>
       <w:pPr>
@@ -1075,7 +998,6 @@
         <w:t>. I am using a HashMap to map Peer {</w:t>
       </w:r>
       <w:proofErr w:type="spellStart"/>
-      <w:proofErr w:type="gramStart"/>
       <w:r>
         <w:rPr>
           <w:sz w:val="28"/>
@@ -1084,7 +1006,6 @@
         <w:t>ip,port</w:t>
       </w:r>
       <w:proofErr w:type="spellEnd"/>
-      <w:proofErr w:type="gramEnd"/>
       <w:r>
         <w:rPr>
           <w:sz w:val="28"/>
@@ -1174,15 +1095,7 @@
           <w:sz w:val="28"/>
           <w:szCs w:val="28"/>
         </w:rPr>
-        <w:t xml:space="preserve"> using flooding. Then how to ensure that the receiver knows that he is the target </w:t>
-      </w:r>
-      <w:proofErr w:type="gramStart"/>
-      <w:r>
-        <w:rPr>
-          <w:sz w:val="28"/>
-          <w:szCs w:val="28"/>
-        </w:rPr>
-        <w:t>destination</w:t>
+        <w:t xml:space="preserve"> using flooding. Then how to ensure that the receiver knows that he is the target destination</w:t>
       </w:r>
       <w:r>
         <w:rPr>
@@ -1191,7 +1104,6 @@
         </w:rPr>
         <w:t xml:space="preserve"> ?</w:t>
       </w:r>
-      <w:proofErr w:type="gramEnd"/>
     </w:p>
     <w:p>
       <w:pPr>
@@ -1330,17 +1242,8 @@
           <w:sz w:val="28"/>
           <w:szCs w:val="28"/>
         </w:rPr>
-        <w:t xml:space="preserve">How to ensure that a certain sent message doesn’t keep on looping </w:t>
-      </w:r>
-      <w:proofErr w:type="gramStart"/>
-      <w:r>
-        <w:rPr>
-          <w:sz w:val="28"/>
-          <w:szCs w:val="28"/>
-        </w:rPr>
-        <w:t>forever ?</w:t>
-      </w:r>
-      <w:proofErr w:type="gramEnd"/>
+        <w:t>How to ensure that a certain sent message doesn’t keep on looping forever ?</w:t>
+      </w:r>
     </w:p>
     <w:p>
       <w:pPr>
@@ -1646,23 +1549,7 @@
           <w:sz w:val="28"/>
           <w:szCs w:val="28"/>
         </w:rPr>
-        <w:t xml:space="preserve">2 simultaneous messages are colliding (clustered message) when </w:t>
-      </w:r>
-      <w:proofErr w:type="gramStart"/>
-      <w:r>
-        <w:rPr>
-          <w:sz w:val="28"/>
-          <w:szCs w:val="28"/>
-        </w:rPr>
-        <w:t>Sending</w:t>
-      </w:r>
-      <w:proofErr w:type="gramEnd"/>
-      <w:r>
-        <w:rPr>
-          <w:sz w:val="28"/>
-          <w:szCs w:val="28"/>
-        </w:rPr>
-        <w:t xml:space="preserve"> from same source</w:t>
+        <w:t>2 simultaneous messages are colliding (clustered message) when Sending from same source</w:t>
       </w:r>
       <w:r>
         <w:rPr>
@@ -1797,7 +1684,6 @@
         <w:t>ting all Peer {</w:t>
       </w:r>
       <w:proofErr w:type="spellStart"/>
-      <w:proofErr w:type="gramStart"/>
       <w:r>
         <w:rPr>
           <w:sz w:val="28"/>
@@ -1806,29 +1692,12 @@
         <w:t>ip,port</w:t>
       </w:r>
       <w:proofErr w:type="spellEnd"/>
-      <w:proofErr w:type="gramEnd"/>
-      <w:r>
-        <w:rPr>
-          <w:sz w:val="28"/>
-          <w:szCs w:val="28"/>
-        </w:rPr>
-        <w:t xml:space="preserve">} into the message header seemed like an inefficient solution. </w:t>
-      </w:r>
-      <w:proofErr w:type="gramStart"/>
-      <w:r>
-        <w:rPr>
-          <w:sz w:val="28"/>
-          <w:szCs w:val="28"/>
-        </w:rPr>
-        <w:t>So</w:t>
-      </w:r>
-      <w:proofErr w:type="gramEnd"/>
-      <w:r>
-        <w:rPr>
-          <w:sz w:val="28"/>
-          <w:szCs w:val="28"/>
-        </w:rPr>
-        <w:t xml:space="preserve"> I put an empty string in the </w:t>
+      <w:r>
+        <w:rPr>
+          <w:sz w:val="28"/>
+          <w:szCs w:val="28"/>
+        </w:rPr>
+        <w:t xml:space="preserve">} into the message header seemed like an inefficient solution. So I put an empty string in the </w:t>
       </w:r>
       <w:proofErr w:type="spellStart"/>
       <w:r>
@@ -1860,23 +1729,7 @@
           <w:sz w:val="28"/>
           <w:szCs w:val="28"/>
         </w:rPr>
-        <w:t xml:space="preserve"> </w:t>
-      </w:r>
-      <w:proofErr w:type="gramStart"/>
-      <w:r>
-        <w:rPr>
-          <w:sz w:val="28"/>
-          <w:szCs w:val="28"/>
-        </w:rPr>
-        <w:t>=  0</w:t>
-      </w:r>
-      <w:proofErr w:type="gramEnd"/>
-      <w:r>
-        <w:rPr>
-          <w:sz w:val="28"/>
-          <w:szCs w:val="28"/>
-        </w:rPr>
-        <w:t xml:space="preserve"> (for General Broadcasts).</w:t>
+        <w:t xml:space="preserve"> =  0 (for General Broadcasts).</w:t>
       </w:r>
       <w:r>
         <w:rPr>
@@ -1939,17 +1792,8 @@
           <w:sz w:val="28"/>
           <w:szCs w:val="28"/>
         </w:rPr>
-        <w:t xml:space="preserve">If a new Peer is connected, then how to inform all other connected Peers about the details of the new </w:t>
-      </w:r>
-      <w:proofErr w:type="gramStart"/>
-      <w:r>
-        <w:rPr>
-          <w:sz w:val="28"/>
-          <w:szCs w:val="28"/>
-        </w:rPr>
-        <w:t>Peer ?</w:t>
-      </w:r>
-      <w:proofErr w:type="gramEnd"/>
+        <w:t>If a new Peer is connected, then how to inform all other connected Peers about the details of the new Peer ?</w:t>
+      </w:r>
       <w:r>
         <w:rPr>
           <w:sz w:val="28"/>
@@ -2154,7 +1998,6 @@
           <w:szCs w:val="28"/>
         </w:rPr>
       </w:pPr>
-      <w:proofErr w:type="gramStart"/>
       <w:r>
         <w:rPr>
           <w:b/>
@@ -2169,31 +2012,7 @@
           <w:sz w:val="28"/>
           <w:szCs w:val="28"/>
         </w:rPr>
-        <w:t>-</w:t>
-      </w:r>
-      <w:proofErr w:type="gramEnd"/>
-      <w:r>
-        <w:rPr>
-          <w:sz w:val="28"/>
-          <w:szCs w:val="28"/>
-        </w:rPr>
-        <w:t xml:space="preserve"> When a new connection </w:t>
-      </w:r>
-      <w:proofErr w:type="gramStart"/>
-      <w:r>
-        <w:rPr>
-          <w:sz w:val="28"/>
-          <w:szCs w:val="28"/>
-        </w:rPr>
-        <w:t>arrives</w:t>
-      </w:r>
-      <w:proofErr w:type="gramEnd"/>
-      <w:r>
-        <w:rPr>
-          <w:sz w:val="28"/>
-          <w:szCs w:val="28"/>
-        </w:rPr>
-        <w:t xml:space="preserve"> I am not fully connecting that to all other nodes. I am just broadcasting their Peer List.</w:t>
+        <w:t>- When a new connection arrives I am not fully connecting that to all other nodes. I am just broadcasting their Peer List.</w:t>
       </w:r>
       <w:r>
         <w:rPr>
@@ -2290,17 +2109,8 @@
           <w:sz w:val="28"/>
           <w:szCs w:val="28"/>
         </w:rPr>
-        <w:t xml:space="preserve"> previously</w:t>
-      </w:r>
-      <w:proofErr w:type="gramStart"/>
-      <w:r>
-        <w:rPr>
-          <w:sz w:val="28"/>
-          <w:szCs w:val="28"/>
-        </w:rPr>
-        <w:t>) ?</w:t>
-      </w:r>
-      <w:proofErr w:type="gramEnd"/>
+        <w:t xml:space="preserve"> previously) ?</w:t>
+      </w:r>
       <w:r>
         <w:rPr>
           <w:sz w:val="28"/>
@@ -2637,26 +2447,9 @@
           <w:sz w:val="28"/>
           <w:szCs w:val="28"/>
         </w:rPr>
-        <w:t xml:space="preserve"> solution to solve this problem. </w:t>
-      </w:r>
-      <w:proofErr w:type="gramStart"/>
-      <w:r>
-        <w:rPr>
-          <w:sz w:val="28"/>
-          <w:szCs w:val="28"/>
-        </w:rPr>
-        <w:t>So</w:t>
-      </w:r>
-      <w:proofErr w:type="gramEnd"/>
-      <w:r>
-        <w:rPr>
-          <w:sz w:val="28"/>
-          <w:szCs w:val="28"/>
-        </w:rPr>
-        <w:t xml:space="preserve"> the only solution was that from Each Peer I send a </w:t>
+        <w:t xml:space="preserve"> solution to solve this problem. So the only solution was that from Each Peer I send a </w:t>
       </w:r>
       <w:proofErr w:type="spellStart"/>
-      <w:proofErr w:type="gramStart"/>
       <w:r>
         <w:rPr>
           <w:sz w:val="28"/>
@@ -2670,15 +2463,7 @@
           <w:sz w:val="28"/>
           <w:szCs w:val="28"/>
         </w:rPr>
-        <w:t>(</w:t>
-      </w:r>
-      <w:proofErr w:type="gramEnd"/>
-      <w:r>
-        <w:rPr>
-          <w:sz w:val="28"/>
-          <w:szCs w:val="28"/>
-        </w:rPr>
-        <w:t xml:space="preserve">) message to every other Peer saying that “I am still connected”. In which case the Peer List for all Peers is calculated </w:t>
+        <w:t xml:space="preserve">() message to every other Peer saying that “I am still connected”. In which case the Peer List for all Peers is calculated </w:t>
       </w:r>
       <w:r>
         <w:rPr>
@@ -2737,31 +2522,7 @@
           <w:sz w:val="28"/>
           <w:szCs w:val="28"/>
         </w:rPr>
-        <w:t xml:space="preserve">O(n) or </w:t>
-      </w:r>
-      <w:proofErr w:type="gramStart"/>
-      <w:r>
-        <w:rPr>
-          <w:b/>
-          <w:bCs/>
-          <w:i/>
-          <w:iCs/>
-          <w:sz w:val="28"/>
-          <w:szCs w:val="28"/>
-        </w:rPr>
-        <w:t>O(</w:t>
-      </w:r>
-      <w:proofErr w:type="gramEnd"/>
-      <w:r>
-        <w:rPr>
-          <w:b/>
-          <w:bCs/>
-          <w:i/>
-          <w:iCs/>
-          <w:sz w:val="28"/>
-          <w:szCs w:val="28"/>
-        </w:rPr>
-        <w:t xml:space="preserve">diameter of Graph) </w:t>
+        <w:t xml:space="preserve">O(n) or O(diameter of Graph) </w:t>
       </w:r>
       <w:r>
         <w:rPr>
@@ -2828,23 +2589,7 @@
           <w:sz w:val="28"/>
           <w:szCs w:val="28"/>
         </w:rPr>
-        <w:t xml:space="preserve">So, my solution is, </w:t>
-      </w:r>
-      <w:proofErr w:type="gramStart"/>
-      <w:r>
-        <w:rPr>
-          <w:sz w:val="28"/>
-          <w:szCs w:val="28"/>
-        </w:rPr>
-        <w:t>From</w:t>
-      </w:r>
-      <w:proofErr w:type="gramEnd"/>
-      <w:r>
-        <w:rPr>
-          <w:sz w:val="28"/>
-          <w:szCs w:val="28"/>
-        </w:rPr>
-        <w:t xml:space="preserve"> each of the remaining Peers broadcast a message to everyone else and whoever can read that message is still reachable. In this case</w:t>
+        <w:t>So, my solution is, From each of the remaining Peers broadcast a message to everyone else and whoever can read that message is still reachable. In this case</w:t>
       </w:r>
       <w:r>
         <w:rPr>
@@ -2927,39 +2672,7 @@
           <w:sz w:val="28"/>
           <w:szCs w:val="28"/>
         </w:rPr>
-        <w:t xml:space="preserve">Commenting or uncommenting print statements each time was a tedious task. </w:t>
-      </w:r>
-      <w:proofErr w:type="gramStart"/>
-      <w:r>
-        <w:rPr>
-          <w:sz w:val="28"/>
-          <w:szCs w:val="28"/>
-        </w:rPr>
-        <w:t>So</w:t>
-      </w:r>
-      <w:proofErr w:type="gramEnd"/>
-      <w:r>
-        <w:rPr>
-          <w:sz w:val="28"/>
-          <w:szCs w:val="28"/>
-        </w:rPr>
-        <w:t xml:space="preserve"> I made a </w:t>
-      </w:r>
-      <w:proofErr w:type="gramStart"/>
-      <w:r>
-        <w:rPr>
-          <w:sz w:val="28"/>
-          <w:szCs w:val="28"/>
-        </w:rPr>
-        <w:t>debug(</w:t>
-      </w:r>
-      <w:proofErr w:type="gramEnd"/>
-      <w:r>
-        <w:rPr>
-          <w:sz w:val="28"/>
-          <w:szCs w:val="28"/>
-        </w:rPr>
-        <w:t>) function, where I put the debug message. If I run the code normally using - ./</w:t>
+        <w:t>Commenting or uncommenting print statements each time was a tedious task. So I made a debug() function, where I put the debug message. If I run the code normally using - ./</w:t>
       </w:r>
       <w:proofErr w:type="spellStart"/>
       <w:r>
@@ -2991,23 +2704,7 @@
           <w:sz w:val="28"/>
           <w:szCs w:val="28"/>
         </w:rPr>
-        <w:t xml:space="preserve">. Then no, </w:t>
-      </w:r>
-      <w:proofErr w:type="gramStart"/>
-      <w:r>
-        <w:rPr>
-          <w:sz w:val="28"/>
-          <w:szCs w:val="28"/>
-        </w:rPr>
-        <w:t>debug(</w:t>
-      </w:r>
-      <w:proofErr w:type="gramEnd"/>
-      <w:r>
-        <w:rPr>
-          <w:sz w:val="28"/>
-          <w:szCs w:val="28"/>
-        </w:rPr>
-        <w:t xml:space="preserve">) is printed. </w:t>
+        <w:t xml:space="preserve">. Then no, debug() is printed. </w:t>
       </w:r>
       <w:r>
         <w:rPr>
@@ -3053,23 +2750,7 @@
           <w:sz w:val="28"/>
           <w:szCs w:val="28"/>
         </w:rPr>
-        <w:t xml:space="preserve"> 1. Putting second argument as 1, enables all </w:t>
-      </w:r>
-      <w:proofErr w:type="gramStart"/>
-      <w:r>
-        <w:rPr>
-          <w:sz w:val="28"/>
-          <w:szCs w:val="28"/>
-        </w:rPr>
-        <w:t>debug(</w:t>
-      </w:r>
-      <w:proofErr w:type="gramEnd"/>
-      <w:r>
-        <w:rPr>
-          <w:sz w:val="28"/>
-          <w:szCs w:val="28"/>
-        </w:rPr>
-        <w:t>) within the code and prints them.</w:t>
+        <w:t xml:space="preserve"> 1. Putting second argument as 1, enables all debug() within the code and prints them.</w:t>
       </w:r>
     </w:p>
     <w:p>
@@ -3309,15 +2990,7 @@
           <w:sz w:val="28"/>
           <w:szCs w:val="28"/>
         </w:rPr>
-        <w:t xml:space="preserve"> has some minor bug fixes to Part 1.</w:t>
-      </w:r>
-      <w:r>
-        <w:rPr>
-          <w:rFonts w:asciiTheme="majorHAnsi" w:hAnsiTheme="majorHAnsi" w:cstheme="majorHAnsi"/>
-          <w:sz w:val="28"/>
-          <w:szCs w:val="28"/>
-        </w:rPr>
-        <w:t xml:space="preserve"> </w:t>
+        <w:t xml:space="preserve"> has some minor bug fixes to Part 1. </w:t>
       </w:r>
     </w:p>
     <w:p>
@@ -3389,39 +3062,7 @@
           <w:sz w:val="28"/>
           <w:szCs w:val="28"/>
         </w:rPr>
-        <w:t xml:space="preserve">For each File after someone acquires is create a </w:t>
-      </w:r>
-      <w:proofErr w:type="gramStart"/>
-      <w:r>
-        <w:rPr>
-          <w:sz w:val="28"/>
-          <w:szCs w:val="28"/>
-        </w:rPr>
-        <w:t>corresponding .owners</w:t>
-      </w:r>
-      <w:proofErr w:type="gramEnd"/>
-      <w:r>
-        <w:rPr>
-          <w:sz w:val="28"/>
-          <w:szCs w:val="28"/>
-        </w:rPr>
-        <w:t xml:space="preserve"> file for it, where it stores the number of owners. If owners&gt;0 then this is private file. </w:t>
-      </w:r>
-      <w:proofErr w:type="gramStart"/>
-      <w:r>
-        <w:rPr>
-          <w:sz w:val="28"/>
-          <w:szCs w:val="28"/>
-        </w:rPr>
-        <w:t>.owners</w:t>
-      </w:r>
-      <w:proofErr w:type="gramEnd"/>
-      <w:r>
-        <w:rPr>
-          <w:sz w:val="28"/>
-          <w:szCs w:val="28"/>
-        </w:rPr>
-        <w:t xml:space="preserve"> file is updated upon each file acquisition or release.</w:t>
+        <w:t>For each File after someone acquires is create a corresponding .owners file for it, where it stores the number of owners. If owners&gt;0 then this is private file. .owners file is updated upon each file acquisition or release.</w:t>
       </w:r>
     </w:p>
     <w:p>
@@ -3505,14 +3146,7 @@
           <w:sz w:val="28"/>
           <w:szCs w:val="28"/>
         </w:rPr>
-        <w:t>same PC</w:t>
-      </w:r>
-      <w:r>
-        <w:rPr>
-          <w:sz w:val="28"/>
-          <w:szCs w:val="28"/>
-        </w:rPr>
-        <w:t>.</w:t>
+        <w:t>same PC.</w:t>
       </w:r>
     </w:p>
     <w:p>
@@ -3634,14 +3268,7 @@
           <w:sz w:val="28"/>
           <w:szCs w:val="28"/>
         </w:rPr>
-        <w:t>Distinguishing various private message requests send by one Peer to another</w:t>
-      </w:r>
-      <w:r>
-        <w:rPr>
-          <w:sz w:val="28"/>
-          <w:szCs w:val="28"/>
-        </w:rPr>
-        <w:t>.</w:t>
+        <w:t>Distinguishing various private message requests send by one Peer to another.</w:t>
       </w:r>
     </w:p>
     <w:p>
@@ -3674,17 +3301,9 @@
           <w:sz w:val="28"/>
           <w:szCs w:val="28"/>
         </w:rPr>
-        <w:t xml:space="preserve"> </w:t>
-      </w:r>
-      <w:r>
-        <w:rPr>
-          <w:sz w:val="28"/>
-          <w:szCs w:val="28"/>
-        </w:rPr>
-        <w:t xml:space="preserve">Earlier I was using </w:t>
+        <w:t xml:space="preserve"> Earlier I was using </w:t>
       </w:r>
       <w:proofErr w:type="spellStart"/>
-      <w:proofErr w:type="gramStart"/>
       <w:r>
         <w:rPr>
           <w:sz w:val="28"/>
@@ -3693,29 +3312,12 @@
         <w:t>destination.port</w:t>
       </w:r>
       <w:proofErr w:type="spellEnd"/>
-      <w:proofErr w:type="gramEnd"/>
-      <w:r>
-        <w:rPr>
-          <w:sz w:val="28"/>
-          <w:szCs w:val="28"/>
-        </w:rPr>
-        <w:t xml:space="preserve"> as the identifier for broadcasts. But since for private messages I can’t do that, I made </w:t>
-      </w:r>
-      <w:proofErr w:type="gramStart"/>
-      <w:r>
-        <w:rPr>
-          <w:sz w:val="28"/>
-          <w:szCs w:val="28"/>
-        </w:rPr>
-        <w:t>a another</w:t>
-      </w:r>
-      <w:proofErr w:type="gramEnd"/>
-      <w:r>
-        <w:rPr>
-          <w:sz w:val="28"/>
-          <w:szCs w:val="28"/>
-        </w:rPr>
-        <w:t xml:space="preserve"> section in previous header for </w:t>
+      <w:r>
+        <w:rPr>
+          <w:sz w:val="28"/>
+          <w:szCs w:val="28"/>
+        </w:rPr>
+        <w:t xml:space="preserve"> as the identifier for broadcasts. But since for private messages I can’t do that, I made a another section in previous header for </w:t>
       </w:r>
       <w:proofErr w:type="spellStart"/>
       <w:r>
@@ -3908,6 +3510,76 @@
     </w:p>
     <w:p>
       <w:pPr>
+        <w:pStyle w:val="ListParagraph"/>
+        <w:ind w:left="643"/>
+        <w:rPr>
+          <w:sz w:val="28"/>
+          <w:szCs w:val="28"/>
+        </w:rPr>
+      </w:pPr>
+    </w:p>
+    <w:p>
+      <w:pPr>
+        <w:pStyle w:val="ListParagraph"/>
+        <w:ind w:left="643"/>
+        <w:rPr>
+          <w:sz w:val="28"/>
+          <w:szCs w:val="28"/>
+        </w:rPr>
+      </w:pPr>
+    </w:p>
+    <w:p>
+      <w:pPr>
+        <w:pStyle w:val="ListParagraph"/>
+        <w:ind w:left="643"/>
+        <w:rPr>
+          <w:sz w:val="28"/>
+          <w:szCs w:val="28"/>
+        </w:rPr>
+      </w:pPr>
+    </w:p>
+    <w:p>
+      <w:pPr>
+        <w:pStyle w:val="ListParagraph"/>
+        <w:ind w:left="643"/>
+        <w:rPr>
+          <w:sz w:val="28"/>
+          <w:szCs w:val="28"/>
+        </w:rPr>
+      </w:pPr>
+    </w:p>
+    <w:p>
+      <w:pPr>
+        <w:pStyle w:val="ListParagraph"/>
+        <w:ind w:left="643"/>
+        <w:rPr>
+          <w:sz w:val="28"/>
+          <w:szCs w:val="28"/>
+        </w:rPr>
+      </w:pPr>
+    </w:p>
+    <w:p>
+      <w:pPr>
+        <w:pStyle w:val="ListParagraph"/>
+        <w:ind w:left="643"/>
+        <w:rPr>
+          <w:sz w:val="28"/>
+          <w:szCs w:val="28"/>
+        </w:rPr>
+      </w:pPr>
+    </w:p>
+    <w:p>
+      <w:pPr>
+        <w:pStyle w:val="ListParagraph"/>
+        <w:ind w:left="643"/>
+        <w:rPr>
+          <w:sz w:val="28"/>
+          <w:szCs w:val="28"/>
+        </w:rPr>
+      </w:pPr>
+    </w:p>
+    <w:p>
+      <w:pPr>
         <w:rPr>
           <w:rFonts w:ascii="Calibri" w:hAnsi="Calibri" w:cs="Calibri"/>
         </w:rPr>
@@ -3931,6 +3603,7 @@
           <w:szCs w:val="48"/>
           <w:u w:val="single"/>
         </w:rPr>
+        <w:lastRenderedPageBreak/>
         <w:t xml:space="preserve">Part </w:t>
       </w:r>
       <w:r>
@@ -3982,7 +3655,7 @@
           <w:sz w:val="28"/>
           <w:szCs w:val="28"/>
         </w:rPr>
-        <w:t>I</w:t>
+        <w:t>How to map files among Peers after hashing filename ?</w:t>
       </w:r>
     </w:p>
     <w:p>
@@ -3990,7 +3663,6 @@
         <w:pStyle w:val="ListParagraph"/>
         <w:ind w:left="643"/>
         <w:rPr>
-          <w:rFonts w:ascii="Calibri" w:hAnsi="Calibri" w:cs="Calibri"/>
           <w:sz w:val="28"/>
           <w:szCs w:val="28"/>
         </w:rPr>
@@ -4012,14 +3684,55 @@
           <w:sz w:val="28"/>
           <w:szCs w:val="28"/>
         </w:rPr>
-        <w:t>I</w:t>
-      </w:r>
-      <w:r>
-        <w:rPr>
-          <w:sz w:val="28"/>
-          <w:szCs w:val="28"/>
-        </w:rPr>
-        <w:tab/>
+        <w:t>Also hash the string (</w:t>
+      </w:r>
+      <w:proofErr w:type="spellStart"/>
+      <w:r>
+        <w:rPr>
+          <w:sz w:val="28"/>
+          <w:szCs w:val="28"/>
+        </w:rPr>
+        <w:t>ip</w:t>
+      </w:r>
+      <w:proofErr w:type="spellEnd"/>
+      <w:r>
+        <w:rPr>
+          <w:sz w:val="28"/>
+          <w:szCs w:val="28"/>
+        </w:rPr>
+        <w:t>+’:’+</w:t>
+      </w:r>
+      <w:proofErr w:type="spellStart"/>
+      <w:r>
+        <w:rPr>
+          <w:sz w:val="28"/>
+          <w:szCs w:val="28"/>
+        </w:rPr>
+        <w:t>port_no</w:t>
+      </w:r>
+      <w:proofErr w:type="spellEnd"/>
+      <w:r>
+        <w:rPr>
+          <w:sz w:val="28"/>
+          <w:szCs w:val="28"/>
+        </w:rPr>
+        <w:t>) and if both values match then assign that file to the given (</w:t>
+      </w:r>
+      <w:proofErr w:type="spellStart"/>
+      <w:r>
+        <w:rPr>
+          <w:sz w:val="28"/>
+          <w:szCs w:val="28"/>
+        </w:rPr>
+        <w:t>ip,port</w:t>
+      </w:r>
+      <w:proofErr w:type="spellEnd"/>
+      <w:r>
+        <w:rPr>
+          <w:sz w:val="28"/>
+          <w:szCs w:val="28"/>
+        </w:rPr>
+        <w:t xml:space="preserve">) Peer. </w:t>
       </w:r>
     </w:p>
     <w:p>
@@ -4027,11 +3740,845 @@
         <w:pStyle w:val="ListParagraph"/>
         <w:ind w:left="643"/>
         <w:rPr>
-          <w:rFonts w:ascii="Calibri" w:hAnsi="Calibri" w:cs="Calibri"/>
-          <w:sz w:val="28"/>
-          <w:szCs w:val="28"/>
-        </w:rPr>
-      </w:pPr>
+          <w:sz w:val="28"/>
+          <w:szCs w:val="28"/>
+        </w:rPr>
+      </w:pPr>
+    </w:p>
+    <w:p>
+      <w:pPr>
+        <w:pStyle w:val="ListParagraph"/>
+        <w:numPr>
+          <w:ilvl w:val="0"/>
+          <w:numId w:val="7"/>
+        </w:numPr>
+        <w:rPr>
+          <w:b/>
+          <w:bCs/>
+          <w:sz w:val="32"/>
+          <w:szCs w:val="32"/>
+        </w:rPr>
+      </w:pPr>
+      <w:r>
+        <w:rPr>
+          <w:b/>
+          <w:bCs/>
+          <w:sz w:val="32"/>
+          <w:szCs w:val="32"/>
+        </w:rPr>
+        <w:t xml:space="preserve">Problem: </w:t>
+      </w:r>
+      <w:r>
+        <w:rPr>
+          <w:sz w:val="28"/>
+          <w:szCs w:val="28"/>
+        </w:rPr>
+        <w:t xml:space="preserve">How </w:t>
+      </w:r>
+      <w:r>
+        <w:rPr>
+          <w:sz w:val="28"/>
+          <w:szCs w:val="28"/>
+        </w:rPr>
+        <w:t>redistribute files after a new Peer arrives / leaves</w:t>
+      </w:r>
+      <w:r>
+        <w:rPr>
+          <w:sz w:val="28"/>
+          <w:szCs w:val="28"/>
+        </w:rPr>
+        <w:t xml:space="preserve"> ?</w:t>
+      </w:r>
+    </w:p>
+    <w:p>
+      <w:pPr>
+        <w:pStyle w:val="ListParagraph"/>
+        <w:ind w:left="643"/>
+        <w:rPr>
+          <w:sz w:val="28"/>
+          <w:szCs w:val="28"/>
+        </w:rPr>
+      </w:pPr>
+      <w:r>
+        <w:rPr>
+          <w:b/>
+          <w:bCs/>
+          <w:sz w:val="32"/>
+          <w:szCs w:val="32"/>
+        </w:rPr>
+        <w:t>Solution:</w:t>
+      </w:r>
+      <w:r>
+        <w:t xml:space="preserve"> </w:t>
+      </w:r>
+      <w:r>
+        <w:rPr>
+          <w:sz w:val="28"/>
+          <w:szCs w:val="28"/>
+        </w:rPr>
+        <w:t>Again</w:t>
+      </w:r>
+      <w:r>
+        <w:rPr>
+          <w:sz w:val="28"/>
+          <w:szCs w:val="28"/>
+        </w:rPr>
+        <w:t>,</w:t>
+      </w:r>
+      <w:r>
+        <w:rPr>
+          <w:sz w:val="28"/>
+          <w:szCs w:val="28"/>
+        </w:rPr>
+        <w:t xml:space="preserve"> hash </w:t>
+      </w:r>
+      <w:r>
+        <w:rPr>
+          <w:sz w:val="28"/>
+          <w:szCs w:val="28"/>
+        </w:rPr>
+        <w:t xml:space="preserve">all </w:t>
+      </w:r>
+      <w:r>
+        <w:rPr>
+          <w:sz w:val="28"/>
+          <w:szCs w:val="28"/>
+        </w:rPr>
+        <w:t>the filename</w:t>
+      </w:r>
+      <w:r>
+        <w:rPr>
+          <w:sz w:val="28"/>
+          <w:szCs w:val="28"/>
+        </w:rPr>
+        <w:t>s</w:t>
+      </w:r>
+      <w:r>
+        <w:rPr>
+          <w:sz w:val="28"/>
+          <w:szCs w:val="28"/>
+        </w:rPr>
+        <w:t xml:space="preserve"> with modulo (</w:t>
+      </w:r>
+      <w:proofErr w:type="spellStart"/>
+      <w:r>
+        <w:rPr>
+          <w:sz w:val="28"/>
+          <w:szCs w:val="28"/>
+        </w:rPr>
+        <w:t>new_active_users</w:t>
+      </w:r>
+      <w:proofErr w:type="spellEnd"/>
+      <w:r>
+        <w:rPr>
+          <w:sz w:val="28"/>
+          <w:szCs w:val="28"/>
+        </w:rPr>
+        <w:t>) and then redistribute the files.</w:t>
+      </w:r>
+      <w:r>
+        <w:rPr>
+          <w:sz w:val="28"/>
+          <w:szCs w:val="28"/>
+        </w:rPr>
+        <w:t xml:space="preserve"> </w:t>
+      </w:r>
+    </w:p>
+    <w:p>
+      <w:pPr>
+        <w:pStyle w:val="ListParagraph"/>
+        <w:ind w:left="643"/>
+        <w:rPr>
+          <w:sz w:val="28"/>
+          <w:szCs w:val="28"/>
+        </w:rPr>
+      </w:pPr>
+    </w:p>
+    <w:p>
+      <w:pPr>
+        <w:pStyle w:val="ListParagraph"/>
+        <w:numPr>
+          <w:ilvl w:val="0"/>
+          <w:numId w:val="7"/>
+        </w:numPr>
+        <w:rPr>
+          <w:b/>
+          <w:bCs/>
+          <w:sz w:val="32"/>
+          <w:szCs w:val="32"/>
+        </w:rPr>
+      </w:pPr>
+      <w:r>
+        <w:rPr>
+          <w:b/>
+          <w:bCs/>
+          <w:sz w:val="32"/>
+          <w:szCs w:val="32"/>
+        </w:rPr>
+        <w:t xml:space="preserve">Problem: </w:t>
+      </w:r>
+      <w:proofErr w:type="spellStart"/>
+      <w:r>
+        <w:rPr>
+          <w:sz w:val="28"/>
+          <w:szCs w:val="28"/>
+        </w:rPr>
+        <w:t>Analyze</w:t>
+      </w:r>
+      <w:proofErr w:type="spellEnd"/>
+      <w:r>
+        <w:rPr>
+          <w:sz w:val="28"/>
+          <w:szCs w:val="28"/>
+        </w:rPr>
+        <w:t xml:space="preserve"> how your chosen hash function affects the amount of content replication and distribution evenly (or unevenly) across the peers.</w:t>
+      </w:r>
+      <w:r>
+        <w:rPr>
+          <w:sz w:val="28"/>
+          <w:szCs w:val="28"/>
+        </w:rPr>
+        <w:t xml:space="preserve"> ?</w:t>
+      </w:r>
+    </w:p>
+    <w:p>
+      <w:pPr>
+        <w:pStyle w:val="ListParagraph"/>
+        <w:ind w:left="643"/>
+        <w:rPr>
+          <w:sz w:val="28"/>
+          <w:szCs w:val="28"/>
+        </w:rPr>
+      </w:pPr>
+      <w:r>
+        <w:rPr>
+          <w:b/>
+          <w:bCs/>
+          <w:sz w:val="32"/>
+          <w:szCs w:val="32"/>
+        </w:rPr>
+        <w:t>Solution:</w:t>
+      </w:r>
+      <w:r>
+        <w:t xml:space="preserve"> </w:t>
+      </w:r>
+      <w:proofErr w:type="spellStart"/>
+      <w:r>
+        <w:rPr>
+          <w:sz w:val="28"/>
+          <w:szCs w:val="28"/>
+        </w:rPr>
+        <w:t>Analyzing</w:t>
+      </w:r>
+      <w:proofErr w:type="spellEnd"/>
+      <w:r>
+        <w:rPr>
+          <w:sz w:val="28"/>
+          <w:szCs w:val="28"/>
+        </w:rPr>
+        <w:t xml:space="preserve"> </w:t>
+      </w:r>
+      <w:r>
+        <w:rPr>
+          <w:b/>
+          <w:bCs/>
+          <w:sz w:val="28"/>
+          <w:szCs w:val="28"/>
+        </w:rPr>
+        <w:t>C</w:t>
+      </w:r>
+      <w:r>
+        <w:rPr>
+          <w:b/>
+          <w:bCs/>
+          <w:sz w:val="28"/>
+          <w:szCs w:val="28"/>
+        </w:rPr>
+        <w:t>ontent distribution</w:t>
+      </w:r>
+      <w:r>
+        <w:rPr>
+          <w:sz w:val="28"/>
+          <w:szCs w:val="28"/>
+        </w:rPr>
+        <w:t xml:space="preserve"> for a Rolling Hash Function (the one I used) is extremely hard, and in most cases not feasible. However, based on testing for a few Peers I have observed that the distribution using the Hash Function</w:t>
+      </w:r>
+      <w:r>
+        <w:rPr>
+          <w:sz w:val="28"/>
+          <w:szCs w:val="28"/>
+        </w:rPr>
+        <w:t xml:space="preserve"> -</w:t>
+      </w:r>
+      <w:r>
+        <w:rPr>
+          <w:sz w:val="28"/>
+          <w:szCs w:val="28"/>
+        </w:rPr>
+        <w:t xml:space="preserve"> </w:t>
+      </w:r>
+      <m:oMath>
+        <m:r>
+          <w:rPr>
+            <w:rFonts w:ascii="Cambria Math" w:hAnsi="Cambria Math"/>
+            <w:sz w:val="28"/>
+            <w:szCs w:val="28"/>
+          </w:rPr>
+          <m:t xml:space="preserve"> </m:t>
+        </m:r>
+        <m:r>
+          <m:rPr>
+            <m:sty m:val="bi"/>
+          </m:rPr>
+          <w:rPr>
+            <w:rFonts w:ascii="Cambria Math" w:hAnsi="Cambria Math"/>
+            <w:sz w:val="28"/>
+            <w:szCs w:val="28"/>
+          </w:rPr>
+          <m:t>Hash</m:t>
+        </m:r>
+        <m:d>
+          <m:dPr>
+            <m:ctrlPr>
+              <w:rPr>
+                <w:rFonts w:ascii="Cambria Math" w:hAnsi="Cambria Math"/>
+                <w:b/>
+                <w:bCs/>
+                <w:i/>
+                <w:sz w:val="28"/>
+                <w:szCs w:val="28"/>
+              </w:rPr>
+            </m:ctrlPr>
+          </m:dPr>
+          <m:e>
+            <m:r>
+              <m:rPr>
+                <m:sty m:val="bi"/>
+              </m:rPr>
+              <w:rPr>
+                <w:rFonts w:ascii="Cambria Math" w:hAnsi="Cambria Math"/>
+                <w:sz w:val="28"/>
+                <w:szCs w:val="28"/>
+              </w:rPr>
+              <m:t>s,n</m:t>
+            </m:r>
+          </m:e>
+        </m:d>
+        <m:r>
+          <m:rPr>
+            <m:sty m:val="bi"/>
+          </m:rPr>
+          <w:rPr>
+            <w:rFonts w:ascii="Cambria Math" w:hAnsi="Cambria Math"/>
+            <w:sz w:val="28"/>
+            <w:szCs w:val="28"/>
+          </w:rPr>
+          <m:t>=</m:t>
+        </m:r>
+        <m:d>
+          <m:dPr>
+            <m:ctrlPr>
+              <w:rPr>
+                <w:rFonts w:ascii="Cambria Math" w:hAnsi="Cambria Math"/>
+                <w:b/>
+                <w:bCs/>
+                <w:i/>
+                <w:sz w:val="28"/>
+                <w:szCs w:val="28"/>
+              </w:rPr>
+            </m:ctrlPr>
+          </m:dPr>
+          <m:e>
+            <m:r>
+              <m:rPr>
+                <m:sty m:val="bi"/>
+              </m:rPr>
+              <w:rPr>
+                <w:rFonts w:ascii="Cambria Math" w:hAnsi="Cambria Math"/>
+                <w:sz w:val="28"/>
+                <w:szCs w:val="28"/>
+              </w:rPr>
+              <m:t>(</m:t>
+            </m:r>
+            <m:nary>
+              <m:naryPr>
+                <m:chr m:val="∑"/>
+                <m:limLoc m:val="undOvr"/>
+                <m:ctrlPr>
+                  <w:rPr>
+                    <w:rFonts w:ascii="Cambria Math" w:hAnsi="Cambria Math"/>
+                    <w:b/>
+                    <w:bCs/>
+                    <w:i/>
+                    <w:sz w:val="28"/>
+                    <w:szCs w:val="28"/>
+                  </w:rPr>
+                </m:ctrlPr>
+              </m:naryPr>
+              <m:sub>
+                <m:r>
+                  <m:rPr>
+                    <m:sty m:val="bi"/>
+                  </m:rPr>
+                  <w:rPr>
+                    <w:rFonts w:ascii="Cambria Math" w:hAnsi="Cambria Math"/>
+                    <w:sz w:val="28"/>
+                    <w:szCs w:val="28"/>
+                  </w:rPr>
+                  <m:t>i=1</m:t>
+                </m:r>
+              </m:sub>
+              <m:sup>
+                <m:r>
+                  <m:rPr>
+                    <m:sty m:val="bi"/>
+                  </m:rPr>
+                  <w:rPr>
+                    <w:rFonts w:ascii="Cambria Math" w:hAnsi="Cambria Math"/>
+                    <w:sz w:val="28"/>
+                    <w:szCs w:val="28"/>
+                  </w:rPr>
+                  <m:t>len</m:t>
+                </m:r>
+                <m:d>
+                  <m:dPr>
+                    <m:ctrlPr>
+                      <w:rPr>
+                        <w:rFonts w:ascii="Cambria Math" w:hAnsi="Cambria Math"/>
+                        <w:b/>
+                        <w:bCs/>
+                        <w:i/>
+                        <w:sz w:val="28"/>
+                        <w:szCs w:val="28"/>
+                      </w:rPr>
+                    </m:ctrlPr>
+                  </m:dPr>
+                  <m:e>
+                    <m:r>
+                      <m:rPr>
+                        <m:sty m:val="bi"/>
+                      </m:rPr>
+                      <w:rPr>
+                        <w:rFonts w:ascii="Cambria Math" w:hAnsi="Cambria Math"/>
+                        <w:sz w:val="28"/>
+                        <w:szCs w:val="28"/>
+                      </w:rPr>
+                      <m:t>s</m:t>
+                    </m:r>
+                  </m:e>
+                </m:d>
+              </m:sup>
+              <m:e>
+                <m:r>
+                  <m:rPr>
+                    <m:sty m:val="bi"/>
+                  </m:rPr>
+                  <w:rPr>
+                    <w:rFonts w:ascii="Cambria Math" w:hAnsi="Cambria Math"/>
+                    <w:sz w:val="28"/>
+                    <w:szCs w:val="28"/>
+                  </w:rPr>
+                  <m:t>s</m:t>
+                </m:r>
+                <m:d>
+                  <m:dPr>
+                    <m:begChr m:val="["/>
+                    <m:endChr m:val="]"/>
+                    <m:ctrlPr>
+                      <w:rPr>
+                        <w:rFonts w:ascii="Cambria Math" w:hAnsi="Cambria Math"/>
+                        <w:b/>
+                        <w:bCs/>
+                        <w:i/>
+                        <w:sz w:val="28"/>
+                        <w:szCs w:val="28"/>
+                      </w:rPr>
+                    </m:ctrlPr>
+                  </m:dPr>
+                  <m:e>
+                    <m:r>
+                      <m:rPr>
+                        <m:sty m:val="bi"/>
+                      </m:rPr>
+                      <w:rPr>
+                        <w:rFonts w:ascii="Cambria Math" w:hAnsi="Cambria Math"/>
+                        <w:sz w:val="28"/>
+                        <w:szCs w:val="28"/>
+                      </w:rPr>
+                      <m:t>i</m:t>
+                    </m:r>
+                  </m:e>
+                </m:d>
+                <m:r>
+                  <m:rPr>
+                    <m:sty m:val="bi"/>
+                  </m:rPr>
+                  <w:rPr>
+                    <w:rFonts w:ascii="Cambria Math" w:hAnsi="Cambria Math"/>
+                    <w:sz w:val="28"/>
+                    <w:szCs w:val="28"/>
+                  </w:rPr>
+                  <m:t>*</m:t>
+                </m:r>
+                <m:sSup>
+                  <m:sSupPr>
+                    <m:ctrlPr>
+                      <w:rPr>
+                        <w:rFonts w:ascii="Cambria Math" w:hAnsi="Cambria Math"/>
+                        <w:b/>
+                        <w:bCs/>
+                        <w:i/>
+                        <w:sz w:val="28"/>
+                        <w:szCs w:val="28"/>
+                      </w:rPr>
+                    </m:ctrlPr>
+                  </m:sSupPr>
+                  <m:e>
+                    <m:r>
+                      <m:rPr>
+                        <m:sty m:val="bi"/>
+                      </m:rPr>
+                      <w:rPr>
+                        <w:rFonts w:ascii="Cambria Math" w:hAnsi="Cambria Math"/>
+                        <w:sz w:val="28"/>
+                        <w:szCs w:val="28"/>
+                      </w:rPr>
+                      <m:t>b</m:t>
+                    </m:r>
+                  </m:e>
+                  <m:sup>
+                    <m:r>
+                      <m:rPr>
+                        <m:sty m:val="bi"/>
+                      </m:rPr>
+                      <w:rPr>
+                        <w:rFonts w:ascii="Cambria Math" w:hAnsi="Cambria Math"/>
+                        <w:sz w:val="28"/>
+                        <w:szCs w:val="28"/>
+                      </w:rPr>
+                      <m:t>len</m:t>
+                    </m:r>
+                    <m:d>
+                      <m:dPr>
+                        <m:ctrlPr>
+                          <w:rPr>
+                            <w:rFonts w:ascii="Cambria Math" w:hAnsi="Cambria Math"/>
+                            <w:b/>
+                            <w:bCs/>
+                            <w:i/>
+                            <w:sz w:val="28"/>
+                            <w:szCs w:val="28"/>
+                          </w:rPr>
+                        </m:ctrlPr>
+                      </m:dPr>
+                      <m:e>
+                        <m:r>
+                          <m:rPr>
+                            <m:sty m:val="bi"/>
+                          </m:rPr>
+                          <w:rPr>
+                            <w:rFonts w:ascii="Cambria Math" w:hAnsi="Cambria Math"/>
+                            <w:sz w:val="28"/>
+                            <w:szCs w:val="28"/>
+                          </w:rPr>
+                          <m:t>s</m:t>
+                        </m:r>
+                      </m:e>
+                    </m:d>
+                    <m:r>
+                      <m:rPr>
+                        <m:sty m:val="bi"/>
+                      </m:rPr>
+                      <w:rPr>
+                        <w:rFonts w:ascii="Cambria Math" w:hAnsi="Cambria Math"/>
+                        <w:sz w:val="28"/>
+                        <w:szCs w:val="28"/>
+                      </w:rPr>
+                      <m:t>-i</m:t>
+                    </m:r>
+                  </m:sup>
+                </m:sSup>
+                <m:r>
+                  <m:rPr>
+                    <m:sty m:val="bi"/>
+                  </m:rPr>
+                  <w:rPr>
+                    <w:rFonts w:ascii="Cambria Math" w:hAnsi="Cambria Math"/>
+                    <w:sz w:val="28"/>
+                    <w:szCs w:val="28"/>
+                  </w:rPr>
+                  <m:t>)modM</m:t>
+                </m:r>
+              </m:e>
+            </m:nary>
+          </m:e>
+        </m:d>
+        <m:r>
+          <m:rPr>
+            <m:sty m:val="bi"/>
+          </m:rPr>
+          <w:rPr>
+            <w:rFonts w:ascii="Cambria Math" w:hAnsi="Cambria Math"/>
+            <w:sz w:val="28"/>
+            <w:szCs w:val="28"/>
+          </w:rPr>
+          <m:t>mod n</m:t>
+        </m:r>
+      </m:oMath>
+      <w:r>
+        <w:rPr>
+          <w:b/>
+          <w:bCs/>
+          <w:sz w:val="28"/>
+          <w:szCs w:val="28"/>
+        </w:rPr>
+        <w:t xml:space="preserve"> </w:t>
+      </w:r>
+      <w:r>
+        <w:rPr>
+          <w:b/>
+          <w:bCs/>
+          <w:sz w:val="28"/>
+          <w:szCs w:val="28"/>
+        </w:rPr>
+        <w:t xml:space="preserve"> </w:t>
+      </w:r>
+      <w:r>
+        <w:rPr>
+          <w:sz w:val="28"/>
+          <w:szCs w:val="28"/>
+        </w:rPr>
+        <w:t xml:space="preserve">, </w:t>
+      </w:r>
+    </w:p>
+    <w:p>
+      <w:pPr>
+        <w:pStyle w:val="ListParagraph"/>
+        <w:ind w:left="643"/>
+        <w:rPr>
+          <w:sz w:val="28"/>
+          <w:szCs w:val="28"/>
+        </w:rPr>
+      </w:pPr>
+      <w:r>
+        <w:rPr>
+          <w:sz w:val="28"/>
+          <w:szCs w:val="28"/>
+        </w:rPr>
+        <w:t xml:space="preserve">taking b = 127 and M = 1e9+7. Gives somewhat skewed results for n&gt;=3 (for the files I had). It had a distribution of </w:t>
+      </w:r>
+      <w:r>
+        <w:rPr>
+          <w:b/>
+          <w:bCs/>
+          <w:i/>
+          <w:iCs/>
+          <w:sz w:val="28"/>
+          <w:szCs w:val="28"/>
+        </w:rPr>
+        <w:t>8-5-0-2</w:t>
+      </w:r>
+      <w:r>
+        <w:rPr>
+          <w:sz w:val="28"/>
+          <w:szCs w:val="28"/>
+        </w:rPr>
+        <w:t xml:space="preserve"> for the files owned by 4 Peers.</w:t>
+      </w:r>
+    </w:p>
+    <w:p>
+      <w:pPr>
+        <w:pStyle w:val="ListParagraph"/>
+        <w:ind w:left="643"/>
+        <w:rPr>
+          <w:sz w:val="28"/>
+          <w:szCs w:val="28"/>
+        </w:rPr>
+      </w:pPr>
+      <w:r>
+        <w:rPr>
+          <w:sz w:val="28"/>
+          <w:szCs w:val="28"/>
+        </w:rPr>
+        <w:t>However, choosing an optimal b and M should give us a mostly uniform distribution even with this Hash Function.</w:t>
+      </w:r>
+    </w:p>
+    <w:p>
+      <w:pPr>
+        <w:ind w:left="720"/>
+        <w:rPr>
+          <w:sz w:val="28"/>
+          <w:szCs w:val="28"/>
+        </w:rPr>
+      </w:pPr>
+      <w:r>
+        <w:rPr>
+          <w:b/>
+          <w:bCs/>
+          <w:sz w:val="28"/>
+          <w:szCs w:val="28"/>
+        </w:rPr>
+        <w:t xml:space="preserve">Content Replication – </w:t>
+      </w:r>
+      <w:r>
+        <w:rPr>
+          <w:sz w:val="28"/>
+          <w:szCs w:val="28"/>
+        </w:rPr>
+        <w:t xml:space="preserve">This completely depends on the sender and receiver. Since, in worst case scenario we have to commit to using flooding anyways to reach destination. But if we can find our destination among the hashed </w:t>
+      </w:r>
+      <w:proofErr w:type="spellStart"/>
+      <w:r>
+        <w:rPr>
+          <w:sz w:val="28"/>
+          <w:szCs w:val="28"/>
+        </w:rPr>
+        <w:t>neighbors</w:t>
+      </w:r>
+      <w:proofErr w:type="spellEnd"/>
+      <w:r>
+        <w:rPr>
+          <w:sz w:val="28"/>
+          <w:szCs w:val="28"/>
+        </w:rPr>
+        <w:t>, content replication will be reduced to some extent.</w:t>
+      </w:r>
+    </w:p>
+    <w:p>
+      <w:pPr>
+        <w:pStyle w:val="ListParagraph"/>
+        <w:ind w:left="643"/>
+        <w:rPr>
+          <w:b/>
+          <w:bCs/>
+          <w:sz w:val="28"/>
+          <w:szCs w:val="28"/>
+        </w:rPr>
+      </w:pPr>
+    </w:p>
+    <w:p>
+      <w:pPr>
+        <w:pStyle w:val="ListParagraph"/>
+        <w:numPr>
+          <w:ilvl w:val="0"/>
+          <w:numId w:val="7"/>
+        </w:numPr>
+        <w:rPr>
+          <w:b/>
+          <w:bCs/>
+          <w:sz w:val="32"/>
+          <w:szCs w:val="32"/>
+        </w:rPr>
+      </w:pPr>
+      <w:r>
+        <w:rPr>
+          <w:b/>
+          <w:bCs/>
+          <w:sz w:val="32"/>
+          <w:szCs w:val="32"/>
+        </w:rPr>
+        <w:t>Bug</w:t>
+      </w:r>
+      <w:r>
+        <w:rPr>
+          <w:b/>
+          <w:bCs/>
+          <w:sz w:val="32"/>
+          <w:szCs w:val="32"/>
+        </w:rPr>
+        <w:t xml:space="preserve">: </w:t>
+      </w:r>
+      <w:r>
+        <w:rPr>
+          <w:sz w:val="28"/>
+          <w:szCs w:val="28"/>
+        </w:rPr>
+        <w:t xml:space="preserve">Disconnecting and then reconnecting to the same Peer using the same </w:t>
+      </w:r>
+      <w:proofErr w:type="spellStart"/>
+      <w:r>
+        <w:rPr>
+          <w:sz w:val="28"/>
+          <w:szCs w:val="28"/>
+        </w:rPr>
+        <w:t>ip,port</w:t>
+      </w:r>
+      <w:proofErr w:type="spellEnd"/>
+      <w:r>
+        <w:rPr>
+          <w:sz w:val="28"/>
+          <w:szCs w:val="28"/>
+        </w:rPr>
+        <w:t xml:space="preserve"> combination causes issues. </w:t>
+      </w:r>
+    </w:p>
+    <w:p>
+      <w:pPr>
+        <w:pStyle w:val="ListParagraph"/>
+        <w:ind w:left="643"/>
+        <w:rPr>
+          <w:sz w:val="28"/>
+          <w:szCs w:val="28"/>
+        </w:rPr>
+      </w:pPr>
+      <w:r>
+        <w:rPr>
+          <w:b/>
+          <w:bCs/>
+          <w:sz w:val="32"/>
+          <w:szCs w:val="32"/>
+        </w:rPr>
+        <w:t>Solution:</w:t>
+      </w:r>
+      <w:r>
+        <w:t xml:space="preserve"> </w:t>
+      </w:r>
+      <w:r>
+        <w:rPr>
+          <w:sz w:val="28"/>
+          <w:szCs w:val="28"/>
+        </w:rPr>
+        <w:t>This is because each unique {</w:t>
+      </w:r>
+      <w:proofErr w:type="spellStart"/>
+      <w:r>
+        <w:rPr>
+          <w:sz w:val="28"/>
+          <w:szCs w:val="28"/>
+        </w:rPr>
+        <w:t>IP,port</w:t>
+      </w:r>
+      <w:proofErr w:type="spellEnd"/>
+      <w:r>
+        <w:rPr>
+          <w:sz w:val="28"/>
+          <w:szCs w:val="28"/>
+        </w:rPr>
+        <w:t>} pair is only taken once by each Peer. Disconnecting doesn’t remove it from that</w:t>
+      </w:r>
+      <w:r>
+        <w:rPr>
+          <w:sz w:val="28"/>
+          <w:szCs w:val="28"/>
+        </w:rPr>
+        <w:t xml:space="preserve"> {</w:t>
+      </w:r>
+      <w:proofErr w:type="spellStart"/>
+      <w:r>
+        <w:rPr>
+          <w:sz w:val="28"/>
+          <w:szCs w:val="28"/>
+        </w:rPr>
+        <w:t>IP,port</w:t>
+      </w:r>
+      <w:proofErr w:type="spellEnd"/>
+      <w:r>
+        <w:rPr>
+          <w:sz w:val="28"/>
+          <w:szCs w:val="28"/>
+        </w:rPr>
+        <w:t>} list and thus still remains marked as active. This can be resolved easily but at the cost of a higher Time Complexity. Thus, for performance issues I decided to leave it as it is. Hence, this Bug is currently not-fixed.</w:t>
+      </w:r>
     </w:p>
     <w:sectPr>
       <w:pgSz w:w="11906" w:h="16838"/>
@@ -6154,6 +6701,16 @@
       <w14:ligatures w14:val="none"/>
     </w:rPr>
   </w:style>
+  <w:style w:type="character" w:styleId="PlaceholderText">
+    <w:name w:val="Placeholder Text"/>
+    <w:basedOn w:val="DefaultParagraphFont"/>
+    <w:uiPriority w:val="99"/>
+    <w:semiHidden/>
+    <w:rsid w:val="00C760A1"/>
+    <w:rPr>
+      <w:color w:val="666666"/>
+    </w:rPr>
+  </w:style>
 </w:styles>
 </file>
 

</xml_diff>